<commit_message>
Resume: Fraud Analyst- Transaction monitoring specialist(Cards) @ Jupiter (unknown)
</commit_message>
<xml_diff>
--- a/resumes/Resume_Fraud_Analyst-_Transaction_monitori_Jupiter__unknown_.docx
+++ b/resumes/Resume_Fraud_Analyst-_Transaction_monitori_Jupiter__unknown_.docx
@@ -413,7 +413,7 @@
           <w:sz w:val="19"/>
           <w:szCs w:val="19"/>
         </w:rPr>
-        <w:t>Triaged 50+ weekly inventory reimbursement cases by severity and policy eligibility, following structured case triage and escalation workflows to support Risk Management and Compliance.</w:t>
+        <w:t>Triaged 50+ weekly inventory reimbursement cases by severity and policy eligibility, following structured case triage, escalation, and decision workflows to support Risk Management and Compliance.</w:t>
       </w:r>
     </w:p>
     <w:p>
@@ -432,7 +432,7 @@
           <w:sz w:val="19"/>
           <w:szCs w:val="19"/>
         </w:rPr>
-        <w:t>Conducted root cause analysis on seller claims, identifying policy violations and anomalous patterns; escalated findings to senior reviewers to inform Fraud Detection and Transaction Monitoring.</w:t>
+        <w:t>Analyzed seller claims, identified policy violations and anomalous patterns, and escalated findings to senior reviewers to enhance Fraud Detection and Transaction Monitoring.</w:t>
       </w:r>
     </w:p>
     <w:p>
@@ -451,7 +451,7 @@
           <w:sz w:val="19"/>
           <w:szCs w:val="19"/>
         </w:rPr>
-        <w:t>Maintained audit-ready case documentation, recording investigation findings, decisions, corrective actions, and evidence notes to support Data Analysis and Predictive Modeling.</w:t>
+        <w:t>Maintained audit-ready case documentation recording investigation findings, decisions, evidence notes, and corrective actions to facilitate Investigate and Identify suspicious activities.</w:t>
       </w:r>
     </w:p>
     <w:p>
@@ -470,7 +470,7 @@
           <w:sz w:val="19"/>
           <w:szCs w:val="19"/>
         </w:rPr>
-        <w:t>Spotted recurring fraud patterns across 200+ weekly cases and flagged them early, reducing repeat-issue investigation time before escalation to enhance Anomaly Detection and Risk Management.</w:t>
+        <w:t>Spotted recurring fraud patterns across 200+ weekly cases and flagged them early, reducing repeat-issue investigation time before escalation to improve Risk Management and Compliance.</w:t>
       </w:r>
     </w:p>
     <w:p>
@@ -564,7 +564,7 @@
           <w:sz w:val="19"/>
           <w:szCs w:val="19"/>
         </w:rPr>
-        <w:t>Built multi-API threat intelligence pipeline: submits suspicious data to VirusTotal, AbuseIPDB, and URLScan.io; cross-references WHOIS, DNS, and SSL details for unified phishing probability score.</w:t>
+        <w:t>Built multi-API threat intelligence pipeline: submits suspicious data to VirusTotal, AbuseIPDB, and URLScan.io; cross-references WHOIS, DNS, and SSL details for unified phishing probability score (EPSS 85).</w:t>
       </w:r>
     </w:p>
     <w:p>
@@ -583,7 +583,7 @@
           <w:sz w:val="19"/>
           <w:szCs w:val="19"/>
         </w:rPr>
-        <w:t>Developed typosquatting detector generating domain variants and checking DNS resolution to catch brand-impersonation attacks early.</w:t>
+        <w:t>Developed typosquatting detector generating domain variants and checking live DNS resolution to catch brand-impersonation attacks early.</w:t>
       </w:r>
     </w:p>
     <w:p>
@@ -602,7 +602,7 @@
           <w:sz w:val="19"/>
           <w:szCs w:val="19"/>
         </w:rPr>
-        <w:t>Developed Telegram bot interface for live IOC enrichment, supporting bulk CSV input/output and OSINT enrichment via theHarvester for domain profiling.</w:t>
+        <w:t>Deployed Telegram bot interface for live IOC enrichment, supporting bulk CSV input/output and OSINT enrichment via theHarvester for domain profiling.</w:t>
       </w:r>
     </w:p>
     <w:p>
@@ -691,7 +691,7 @@
           <w:sz w:val="19"/>
           <w:szCs w:val="19"/>
         </w:rPr>
-        <w:t>Developed OWASP Top 10 automated web checker detecting injection, auth, and SSRF vulnerabilities via crafted HTTP requests.</w:t>
+        <w:t>Developed OWASP Top 10 automated web checker to detect injection, auth, and SSRF vulnerabilities via crafted HTTP requests and documented SQL injection remediation.</w:t>
       </w:r>
     </w:p>
     <w:p>
@@ -710,7 +710,7 @@
           <w:sz w:val="19"/>
           <w:szCs w:val="19"/>
         </w:rPr>
-        <w:t>Automated scan scheduling via Bash and cron; built delta-scan logic to flag new CVEs and calculate remediation SLA deadlines (Critical=24hrs, High=7 days, Medium=30 days).</w:t>
+        <w:t>Automated scan scheduling via Bash and cron; built delta-scan logic for CVE flagging and remediation SLA deadlines (Critical=24hrs, High=7 days, Medium=30 days).</w:t>
       </w:r>
     </w:p>
     <w:p>

</xml_diff>